<commit_message>
Uygulama: senaryo MC aralığı merkeze göre kaydırıldı; belgeler ve docx güncellendi (kapı düzeltmesi)
Co-Authored-By: Claude Sonnet 5.5 <noreply@anthropic.com>
Claude-Session: https://claude.ai/code/session_016Bsrb3SBJEhezQbaJR7Erg
</commit_message>
<xml_diff>
--- a/HEKIS_Sistemin_Butunu.docx
+++ b/HEKIS_Sistemin_Butunu.docx
@@ -1737,7 +1737,7 @@
           <w:sz w:val="22"/>
           <w:szCs w:val="22"/>
         </w:rPr>
-        <w:t xml:space="preserve">katılım %15-38 arası; genel bedel tahsilatı ≥%20 ve lüks tahsilat buna bağlı (genel %30 ise lüks ≥%18); kiracı tahsilatı ≥%80; ölçülen hane geliri varsayımın ≥%85’i; bedel/sübvansiyon ≥1,25.</w:t>
+        <w:t xml:space="preserve">katılım en az %15; genel bedel tahsilatı ≥%20 ve lüks tahsilat buna bağlı (genel %30 ise lüks ≥%18); kiracı tahsilatı ≥%80; ölçülen hane geliri varsayımın ≥%85’i; bedel/sübvansiyon ≥1,25.</w:t>
       </w:r>
     </w:p>
     <w:p>
@@ -1788,7 +1788,7 @@
           <w:sz w:val="22"/>
           <w:szCs w:val="22"/>
         </w:rPr>
-        <w:t xml:space="preserve">tam İstanbul’a modelde 7. yılda ulaşılır. Kademeli yol, kötü bir hukuki sürprizde kaybı büyük ölçüde küçültür: bedelin iptali 3. yılda gelirse yük yaklaşık 4 mr TL (20 yıl), tam ölçekte gelseydi yaklaşık 84 mr TL.</w:t>
+        <w:t xml:space="preserve">kusursuz ölçümle tam İstanbul’a 7. yılda ulaşılır. Belirsiz değerlerle (200 rastgele çekim) sonuç iki kutuplu: yaklaşık %37’sinde kapı hiç geçilmez (katılım %15’in altında kalır), yaklaşık %50’sinde 7. yılda tam ölçeğe ulaşılır. Kademeli yol, kötü bir hukuki sürprizde kaybı büyük ölçüde küçültür: bedelin iptali 3. yılda gelirse yük yaklaşık 4 mr TL (20 yıl), tam ölçekte gelseydi yaklaşık 84 mr TL.</w:t>
       </w:r>
     </w:p>
     <w:p>

</xml_diff>